<commit_message>
feat(docx-standardizer/generate_samples): _make_master 内容扩充，让 sc05 beat1 master 全屏特写 1.5s 有视觉密度
Co-Authored-By: Claude Opus 4.7 (1M context) <noreply@anthropic.com>
</commit_message>
<xml_diff>
--- a/docx-standardizer/master.docx
+++ b/docx-standardizer/master.docx
@@ -7,7 +7,7 @@
         <w:pStyle w:val="Title"/>
       </w:pPr>
       <w:r>
-        <w:t>Master Template</w:t>
+        <w:t>Document Title (Master Template)</w:t>
       </w:r>
     </w:p>
     <w:p>
@@ -15,7 +15,13 @@
         <w:pStyle w:val="Heading1"/>
       </w:pPr>
       <w:r>
-        <w:t>Section</w:t>
+        <w:t>1. Section Heading</w:t>
+      </w:r>
+    </w:p>
+    <w:p>
+      <w:pPr/>
+      <w:r>
+        <w:t>Body paragraphs use the Normal style: 11pt, black, no bold. Use this style for all running text, regardless of section.</w:t>
       </w:r>
     </w:p>
     <w:p>
@@ -23,13 +29,13 @@
         <w:pStyle w:val="Heading2"/>
       </w:pPr>
       <w:r>
-        <w:t>Subsection</w:t>
+        <w:t>1.1 Subsection Heading</w:t>
       </w:r>
     </w:p>
     <w:p>
       <w:pPr/>
       <w:r>
-        <w:t>Body text in Normal style.</w:t>
+        <w:t>Subsections inherit Normal styling for their body content. All headings, numbering, and color come from this master.</w:t>
       </w:r>
     </w:p>
     <w:tbl>
@@ -47,13 +53,43 @@
           <w:tcPr>
             <w:tcW w:type="dxa" w:w="4320"/>
           </w:tcPr>
-          <w:p/>
+          <w:p>
+            <w:r>
+              <w:t>Column A</w:t>
+            </w:r>
+          </w:p>
         </w:tc>
         <w:tc>
           <w:tcPr>
             <w:tcW w:type="dxa" w:w="4320"/>
           </w:tcPr>
-          <w:p/>
+          <w:p>
+            <w:r>
+              <w:t>Column B</w:t>
+            </w:r>
+          </w:p>
+        </w:tc>
+      </w:tr>
+      <w:tr>
+        <w:tc>
+          <w:tcPr>
+            <w:tcW w:type="dxa" w:w="4320"/>
+          </w:tcPr>
+          <w:p>
+            <w:r>
+              <w:t>Sample value</w:t>
+            </w:r>
+          </w:p>
+        </w:tc>
+        <w:tc>
+          <w:tcPr>
+            <w:tcW w:type="dxa" w:w="4320"/>
+          </w:tcPr>
+          <w:p>
+            <w:r>
+              <w:t>Sample value</w:t>
+            </w:r>
+          </w:p>
         </w:tc>
       </w:tr>
     </w:tbl>

</xml_diff>